<commit_message>
Embed §8.1 dashboard charts as inline images in Sabesp Mensal docx
Renders IC bar, IQS bar, and photo-conformity stacked chart via kaleido
to PNG bytes, then binds each as a docxtpl.InlineImage under the §8.1
MAPEAMENTO heading. The skeleton preprocessor inserts the three
placeholders ({{ ic_bar }}, {{ iqs_bar }}, {{ photo_conformity }})
immediately under the §8.1 heading so auditors get the same charts the
dashboard shows without pasting screenshots manually.

Co-Authored-By: Claude Opus 4.7 <noreply@anthropic.com>
</commit_message>
<xml_diff>
--- a/app/core/templates/docx_skeletons/mensal_sabesp.docx
+++ b/app/core/templates/docx_skeletons/mensal_sabesp.docx
@@ -3735,6 +3735,21 @@
         <w:t>)</w:t>
       </w:r>
       <w:bookmarkEnd w:id="18"/>
+    </w:p>
+    <w:p>
+      <w:r>
+        <w:t>{{ ic_bar }}</w:t>
+      </w:r>
+    </w:p>
+    <w:p>
+      <w:r>
+        <w:t>{{ iqs_bar }}</w:t>
+      </w:r>
+    </w:p>
+    <w:p>
+      <w:r>
+        <w:t>{{ photo_conformity }}</w:t>
+      </w:r>
     </w:p>
     <w:p>
       <w:pPr>

</xml_diff>